<commit_message>
v08 ist nun fertig
</commit_message>
<xml_diff>
--- a/Python_Files/_Organisatorisch/Raspi-Anleitung.docx
+++ b/Python_Files/_Organisatorisch/Raspi-Anleitung.docx
@@ -207,13 +207,37 @@
           <w:b/>
           <w:bCs/>
         </w:rPr>
-        <w:t>SSH aktivieren (für headless Setup):</w:t>
+        <w:t xml:space="preserve">SSH aktivieren (für </w:t>
+      </w:r>
+      <w:proofErr w:type="spellStart"/>
+      <w:r>
+        <w:rPr>
+          <w:b/>
+          <w:bCs/>
+        </w:rPr>
+        <w:t>headless</w:t>
+      </w:r>
+      <w:proofErr w:type="spellEnd"/>
+      <w:r>
+        <w:rPr>
+          <w:b/>
+          <w:bCs/>
+        </w:rPr>
+        <w:t xml:space="preserve"> Setup):</w:t>
       </w:r>
       <w:r>
         <w:br/>
       </w:r>
       <w:r>
-        <w:t>Im Raspberry Pi Imager, unter "Advanced Options", kannst du SSH aktivieren und Benutzername/Passwort setzen.</w:t>
+        <w:t>Im Raspberry Pi Imager, unter "</w:t>
+      </w:r>
+      <w:proofErr w:type="spellStart"/>
+      <w:r>
+        <w:t>Advanced</w:t>
+      </w:r>
+      <w:proofErr w:type="spellEnd"/>
+      <w:r>
+        <w:t xml:space="preserve"> Options", kannst du SSH aktivieren und Benutzername/Passwort setzen.</w:t>
       </w:r>
     </w:p>
     <w:p>
@@ -237,8 +261,13 @@
       <w:r>
         <w:br/>
       </w:r>
-      <w:r>
-        <w:t>Verbinde den Raspberry Pi per Ethernet-Kabel direkt mit dem PC oder mit einem Switch/Router.</w:t>
+      <w:proofErr w:type="gramStart"/>
+      <w:r>
+        <w:t>Verbinde</w:t>
+      </w:r>
+      <w:proofErr w:type="gramEnd"/>
+      <w:r>
+        <w:t xml:space="preserve"> den Raspberry Pi per Ethernet-Kabel direkt mit dem PC oder mit einem Switch/Router.</w:t>
       </w:r>
     </w:p>
     <w:p>
@@ -287,7 +316,23 @@
         <w:spacing w:line="240" w:lineRule="auto"/>
       </w:pPr>
       <w:r>
-        <w:t>Alternative: Router/PC per DHCP eine IP zuweisen lassen und dann die IP im Router ablesen oder mit Tools wie arp -a oder nmap scannen.</w:t>
+        <w:t>Alternative: Router/PC per DHCP eine IP zuweisen lassen und dann die IP im Router ablesen oder mit Tools wie </w:t>
+      </w:r>
+      <w:proofErr w:type="spellStart"/>
+      <w:r>
+        <w:t>arp</w:t>
+      </w:r>
+      <w:proofErr w:type="spellEnd"/>
+      <w:r>
+        <w:t xml:space="preserve"> -a oder </w:t>
+      </w:r>
+      <w:proofErr w:type="spellStart"/>
+      <w:r>
+        <w:t>nmap</w:t>
+      </w:r>
+      <w:proofErr w:type="spellEnd"/>
+      <w:r>
+        <w:t> scannen.</w:t>
       </w:r>
     </w:p>
     <w:p>
@@ -312,8 +357,13 @@
       <w:r>
         <w:br/>
       </w:r>
-      <w:r>
-        <w:t>Öffne ein Terminal auf dem PC und ping die IP des Raspberry Pi: ping &lt;IP-Adresse&gt;</w:t>
+      <w:proofErr w:type="gramStart"/>
+      <w:r>
+        <w:t>Öffne</w:t>
+      </w:r>
+      <w:proofErr w:type="gramEnd"/>
+      <w:r>
+        <w:t xml:space="preserve"> ein Terminal auf dem PC und ping die IP des Raspberry Pi: ping &lt;IP-Adresse&gt;</w:t>
       </w:r>
     </w:p>
     <w:p>
@@ -347,7 +397,23 @@
         <w:spacing w:line="240" w:lineRule="auto"/>
       </w:pPr>
       <w:r>
-        <w:t>Verwende einen SSH-Client (wie PuTTY auf Windows oder Terminal auf Linux/Mac): ssh pi@&lt;IP-Adresse&gt;</w:t>
+        <w:t>Verwende einen SSH-Client (wie PuTTY auf Windows oder Terminal auf Linux/Mac): </w:t>
+      </w:r>
+      <w:proofErr w:type="spellStart"/>
+      <w:r>
+        <w:t>ssh</w:t>
+      </w:r>
+      <w:proofErr w:type="spellEnd"/>
+      <w:r>
+        <w:t xml:space="preserve"> </w:t>
+      </w:r>
+      <w:proofErr w:type="spellStart"/>
+      <w:r>
+        <w:t>pi</w:t>
+      </w:r>
+      <w:proofErr w:type="spellEnd"/>
+      <w:r>
+        <w:t>@&lt;IP-Adresse&gt;</w:t>
       </w:r>
     </w:p>
     <w:p>
@@ -362,7 +428,15 @@
         <w:spacing w:line="240" w:lineRule="auto"/>
       </w:pPr>
       <w:r>
-        <w:t>Passwort eingeben (standardmäßig oft "raspberry", falls nicht geändert).</w:t>
+        <w:t>Passwort eingeben (standardmäßig oft "</w:t>
+      </w:r>
+      <w:proofErr w:type="spellStart"/>
+      <w:r>
+        <w:t>raspberry</w:t>
+      </w:r>
+      <w:proofErr w:type="spellEnd"/>
+      <w:r>
+        <w:t>", falls nicht geändert).</w:t>
       </w:r>
     </w:p>
     <w:p>
@@ -478,7 +552,49 @@
         <w:rPr>
           <w:lang w:val="en-GB"/>
         </w:rPr>
-        <w:t>Updates durchführen: sudo apt update &amp;&amp; sudo apt upgrade</w:t>
+        <w:t xml:space="preserve">Updates </w:t>
+      </w:r>
+      <w:proofErr w:type="spellStart"/>
+      <w:r>
+        <w:rPr>
+          <w:lang w:val="en-GB"/>
+        </w:rPr>
+        <w:t>durchführen</w:t>
+      </w:r>
+      <w:proofErr w:type="spellEnd"/>
+      <w:r>
+        <w:rPr>
+          <w:lang w:val="en-GB"/>
+        </w:rPr>
+        <w:t>: </w:t>
+      </w:r>
+      <w:proofErr w:type="spellStart"/>
+      <w:r>
+        <w:rPr>
+          <w:lang w:val="en-GB"/>
+        </w:rPr>
+        <w:t>sudo</w:t>
+      </w:r>
+      <w:proofErr w:type="spellEnd"/>
+      <w:r>
+        <w:rPr>
+          <w:lang w:val="en-GB"/>
+        </w:rPr>
+        <w:t xml:space="preserve"> apt update &amp;&amp; </w:t>
+      </w:r>
+      <w:proofErr w:type="spellStart"/>
+      <w:r>
+        <w:rPr>
+          <w:lang w:val="en-GB"/>
+        </w:rPr>
+        <w:t>sudo</w:t>
+      </w:r>
+      <w:proofErr w:type="spellEnd"/>
+      <w:r>
+        <w:rPr>
+          <w:lang w:val="en-GB"/>
+        </w:rPr>
+        <w:t xml:space="preserve"> apt upgrade</w:t>
       </w:r>
     </w:p>
     <w:p>
@@ -493,7 +609,15 @@
         <w:spacing w:line="240" w:lineRule="auto"/>
       </w:pPr>
       <w:r>
-        <w:t>Notwendige Software installieren: Python3, OpenCV, PyQt6, etc.</w:t>
+        <w:t xml:space="preserve">Notwendige Software installieren: Python3, </w:t>
+      </w:r>
+      <w:proofErr w:type="spellStart"/>
+      <w:r>
+        <w:t>OpenCV</w:t>
+      </w:r>
+      <w:proofErr w:type="spellEnd"/>
+      <w:r>
+        <w:t>, PyQt6, etc.</w:t>
       </w:r>
     </w:p>
     <w:p>
@@ -601,7 +725,15 @@
         <w:spacing w:line="240" w:lineRule="auto"/>
       </w:pPr>
       <w:r>
-        <w:t>Auf dem Raspberry Pi: VNC Server installieren und aktivieren.</w:t>
+        <w:t xml:space="preserve">Auf dem Raspberry Pi: </w:t>
+      </w:r>
+      <w:proofErr w:type="gramStart"/>
+      <w:r>
+        <w:t>VNC Server</w:t>
+      </w:r>
+      <w:proofErr w:type="gramEnd"/>
+      <w:r>
+        <w:t xml:space="preserve"> installieren und aktivieren.</w:t>
       </w:r>
     </w:p>
     <w:p>
@@ -616,7 +748,15 @@
         <w:spacing w:line="240" w:lineRule="auto"/>
       </w:pPr>
       <w:r>
-        <w:t>Auf dem PC: VNC Viewer installieren und mit der IP des Raspberry Pi verbinden.</w:t>
+        <w:t xml:space="preserve">Auf dem PC: </w:t>
+      </w:r>
+      <w:proofErr w:type="gramStart"/>
+      <w:r>
+        <w:t>VNC Viewer</w:t>
+      </w:r>
+      <w:proofErr w:type="gramEnd"/>
+      <w:r>
+        <w:t xml:space="preserve"> installieren und mit der IP des Raspberry Pi verbinden.</w:t>
       </w:r>
     </w:p>
     <w:p>
@@ -631,6 +771,122 @@
       <w:pPr>
         <w:spacing w:line="240" w:lineRule="auto"/>
       </w:pPr>
+    </w:p>
+    <w:p>
+      <w:pPr>
+        <w:spacing w:line="240" w:lineRule="auto"/>
+      </w:pPr>
+    </w:p>
+    <w:p>
+      <w:pPr>
+        <w:spacing w:line="240" w:lineRule="auto"/>
+      </w:pPr>
+    </w:p>
+    <w:p>
+      <w:pPr>
+        <w:spacing w:line="240" w:lineRule="auto"/>
+      </w:pPr>
+    </w:p>
+    <w:p>
+      <w:pPr>
+        <w:spacing w:line="240" w:lineRule="auto"/>
+      </w:pPr>
+      <w:r>
+        <w:lastRenderedPageBreak/>
+        <w:drawing>
+          <wp:inline distT="0" distB="0" distL="0" distR="0" wp14:anchorId="297A3EC5" wp14:editId="667BD590">
+            <wp:extent cx="5760720" cy="4043045"/>
+            <wp:effectExtent l="0" t="0" r="0" b="0"/>
+            <wp:docPr id="1139494699" name="Grafik 1" descr="Ein Bild, das Text, Screenshot, Software, Multimedia-Software enthält.&#10;&#10;KI-generierte Inhalte können fehlerhaft sein."/>
+            <wp:cNvGraphicFramePr>
+              <a:graphicFrameLocks xmlns:a="http://schemas.openxmlformats.org/drawingml/2006/main" noChangeAspect="1"/>
+            </wp:cNvGraphicFramePr>
+            <a:graphic xmlns:a="http://schemas.openxmlformats.org/drawingml/2006/main">
+              <a:graphicData uri="http://schemas.openxmlformats.org/drawingml/2006/picture">
+                <pic:pic xmlns:pic="http://schemas.openxmlformats.org/drawingml/2006/picture">
+                  <pic:nvPicPr>
+                    <pic:cNvPr id="1139494699" name="Grafik 1" descr="Ein Bild, das Text, Screenshot, Software, Multimedia-Software enthält.&#10;&#10;KI-generierte Inhalte können fehlerhaft sein."/>
+                    <pic:cNvPicPr/>
+                  </pic:nvPicPr>
+                  <pic:blipFill>
+                    <a:blip r:embed="rId7"/>
+                    <a:stretch>
+                      <a:fillRect/>
+                    </a:stretch>
+                  </pic:blipFill>
+                  <pic:spPr>
+                    <a:xfrm>
+                      <a:off x="0" y="0"/>
+                      <a:ext cx="5760720" cy="4043045"/>
+                    </a:xfrm>
+                    <a:prstGeom prst="rect">
+                      <a:avLst/>
+                    </a:prstGeom>
+                  </pic:spPr>
+                </pic:pic>
+              </a:graphicData>
+            </a:graphic>
+          </wp:inline>
+        </w:drawing>
+      </w:r>
+    </w:p>
+    <w:p>
+      <w:pPr>
+        <w:spacing w:line="240" w:lineRule="auto"/>
+      </w:pPr>
+    </w:p>
+    <w:p>
+      <w:pPr>
+        <w:spacing w:line="240" w:lineRule="auto"/>
+      </w:pPr>
+    </w:p>
+    <w:p>
+      <w:pPr>
+        <w:spacing w:line="240" w:lineRule="auto"/>
+      </w:pPr>
+      <w:r>
+        <w:t>Wäge Zelle auf ADC</w:t>
+      </w:r>
+      <w:r>
+        <w:br/>
+      </w:r>
+      <w:r>
+        <w:drawing>
+          <wp:inline distT="0" distB="0" distL="0" distR="0" wp14:anchorId="1D5CD554" wp14:editId="5AC60200">
+            <wp:extent cx="2667000" cy="1263316"/>
+            <wp:effectExtent l="0" t="0" r="0" b="0"/>
+            <wp:docPr id="423214916" name="Grafik 1" descr="Ein Bild, das Text, Screenshot, Schrift, Zahl enthält.&#10;&#10;KI-generierte Inhalte können fehlerhaft sein."/>
+            <wp:cNvGraphicFramePr>
+              <a:graphicFrameLocks xmlns:a="http://schemas.openxmlformats.org/drawingml/2006/main" noChangeAspect="1"/>
+            </wp:cNvGraphicFramePr>
+            <a:graphic xmlns:a="http://schemas.openxmlformats.org/drawingml/2006/main">
+              <a:graphicData uri="http://schemas.openxmlformats.org/drawingml/2006/picture">
+                <pic:pic xmlns:pic="http://schemas.openxmlformats.org/drawingml/2006/picture">
+                  <pic:nvPicPr>
+                    <pic:cNvPr id="423214916" name="Grafik 1" descr="Ein Bild, das Text, Screenshot, Schrift, Zahl enthält.&#10;&#10;KI-generierte Inhalte können fehlerhaft sein."/>
+                    <pic:cNvPicPr/>
+                  </pic:nvPicPr>
+                  <pic:blipFill>
+                    <a:blip r:embed="rId8"/>
+                    <a:stretch>
+                      <a:fillRect/>
+                    </a:stretch>
+                  </pic:blipFill>
+                  <pic:spPr>
+                    <a:xfrm>
+                      <a:off x="0" y="0"/>
+                      <a:ext cx="2669640" cy="1264566"/>
+                    </a:xfrm>
+                    <a:prstGeom prst="rect">
+                      <a:avLst/>
+                    </a:prstGeom>
+                  </pic:spPr>
+                </pic:pic>
+              </a:graphicData>
+            </a:graphic>
+          </wp:inline>
+        </w:drawing>
+      </w:r>
     </w:p>
     <w:sectPr>
       <w:pgSz w:w="11906" w:h="16838"/>

</xml_diff>